<commit_message>
learning-designer: allow inline script, fix publishing guidance, neutralise sample data
</commit_message>
<xml_diff>
--- a/Skills/learning-designer/demo/sample-files/sample-learning-request-brief-custom-skills-powerpoint.docx
+++ b/Skills/learning-designer/demo/sample-files/sample-learning-request-brief-custom-skills-powerpoint.docx
@@ -254,7 +254,7 @@
         <w:t xml:space="preserve">Authoritative Source: </w:t>
       </w:r>
       <w:r>
-        <w:t xml:space="preserve">Microsoft support guidance on Custom Skills in PowerPoint + the co-created learning page at anandragav.github.io/copilot-html-dashboards/custom-skills-in-powerpoint/</w:t>
+        <w:t xml:space="preserve">Microsoft support guidance on Custom Skills in PowerPoint</w:t>
       </w:r>
     </w:p>
     <w:p>
@@ -278,7 +278,7 @@
         <w:t xml:space="preserve">Owner / Contact: </w:t>
       </w:r>
       <w:r>
-        <w:t xml:space="preserve">Anand</w:t>
+        <w:t xml:space="preserve">Megan Bowen</w:t>
       </w:r>
     </w:p>
     <w:p>

</xml_diff>